<commit_message>
se actualizan las plantillas de certificados
</commit_message>
<xml_diff>
--- a/Util/plantilla_certificado_manuel.docx
+++ b/Util/plantilla_certificado_manuel.docx
@@ -1384,8 +1384,8 @@
           <v:path o:extrusionok="f" gradientshapeok="t" o:connecttype="rect"/>
           <o:lock v:ext="edit" aspectratio="t"/>
         </v:shapetype>
-        <v:shape id="WordPictureWatermark1436037922" o:spid="_x0000_s2054" type="#_x0000_t75" style="position:absolute;margin-left:0;margin-top:0;width:450.65pt;height:450.65pt;z-index:-251657216;mso-position-horizontal:center;mso-position-horizontal-relative:margin;mso-position-vertical:center;mso-position-vertical-relative:margin" o:allowincell="f">
-          <v:imagedata r:id="rId1" o:title="aplicaciones-logo-1"/>
+        <v:shape id="WordPictureWatermark1448831172" o:spid="_x0000_s2054" type="#_x0000_t75" style="position:absolute;margin-left:0;margin-top:0;width:450.65pt;height:450.65pt;z-index:-251657216;mso-position-horizontal:center;mso-position-horizontal-relative:margin;mso-position-vertical:center;mso-position-vertical-relative:margin" o:allowincell="f">
+          <v:imagedata r:id="rId1" o:title="aplicaciones-logo-1" gain="19661f" blacklevel="22938f"/>
           <w10:wrap anchorx="margin" anchory="margin"/>
         </v:shape>
       </w:pict>
@@ -1421,8 +1421,8 @@
           <v:path o:extrusionok="f" gradientshapeok="t" o:connecttype="rect"/>
           <o:lock v:ext="edit" aspectratio="t"/>
         </v:shapetype>
-        <v:shape id="WordPictureWatermark1436037923" o:spid="_x0000_s2055" type="#_x0000_t75" style="position:absolute;margin-left:0;margin-top:0;width:450.65pt;height:450.65pt;z-index:-251656192;mso-position-horizontal:center;mso-position-horizontal-relative:margin;mso-position-vertical:center;mso-position-vertical-relative:margin" o:allowincell="f">
-          <v:imagedata r:id="rId1" o:title="aplicaciones-logo-1"/>
+        <v:shape id="WordPictureWatermark1448831173" o:spid="_x0000_s2055" type="#_x0000_t75" style="position:absolute;margin-left:0;margin-top:0;width:450.65pt;height:450.65pt;z-index:-251656192;mso-position-horizontal:center;mso-position-horizontal-relative:margin;mso-position-vertical:center;mso-position-vertical-relative:margin" o:allowincell="f">
+          <v:imagedata r:id="rId1" o:title="aplicaciones-logo-1" gain="19661f" blacklevel="22938f"/>
           <w10:wrap anchorx="margin" anchory="margin"/>
         </v:shape>
       </w:pict>
@@ -1461,8 +1461,8 @@
           <v:path o:extrusionok="f" gradientshapeok="t" o:connecttype="rect"/>
           <o:lock v:ext="edit" aspectratio="t"/>
         </v:shapetype>
-        <v:shape id="WordPictureWatermark1436037921" o:spid="_x0000_s2053" type="#_x0000_t75" style="position:absolute;margin-left:0;margin-top:0;width:450.65pt;height:450.65pt;z-index:-251658240;mso-position-horizontal:center;mso-position-horizontal-relative:margin;mso-position-vertical:center;mso-position-vertical-relative:margin" o:allowincell="f">
-          <v:imagedata r:id="rId1" o:title="aplicaciones-logo-1"/>
+        <v:shape id="WordPictureWatermark1448831171" o:spid="_x0000_s2053" type="#_x0000_t75" style="position:absolute;margin-left:0;margin-top:0;width:450.65pt;height:450.65pt;z-index:-251658240;mso-position-horizontal:center;mso-position-horizontal-relative:margin;mso-position-vertical:center;mso-position-vertical-relative:margin" o:allowincell="f">
+          <v:imagedata r:id="rId1" o:title="aplicaciones-logo-1" gain="19661f" blacklevel="22938f"/>
           <w10:wrap anchorx="margin" anchory="margin"/>
         </v:shape>
       </w:pict>

</xml_diff>